<commit_message>
taking damage and dying animations along with collisions bug fixes
</commit_message>
<xml_diff>
--- a/documents/Checklist.docx
+++ b/documents/Checklist.docx
@@ -1234,6 +1234,18 @@
           <w:p>
             <w:r>
               <w:t>Also fix enemy movement</w:t>
+            </w:r>
+          </w:p>
+          <w:p/>
+          <w:p>
+            <w:r>
+              <w:t xml:space="preserve">Attack </w:t>
+            </w:r>
+            <w:r>
+              <w:t>w</w:t>
+            </w:r>
+            <w:r>
+              <w:t xml:space="preserve">orks fine, add enemies, make them deal damage </w:t>
             </w:r>
           </w:p>
         </w:tc>

</xml_diff>